<commit_message>
Cambio de formato vacaciones becarios
</commit_message>
<xml_diff>
--- a/api/src/recursos/plantillas_docx/Formato_Vacaciones_Becarios.docx
+++ b/api/src/recursos/plantillas_docx/Formato_Vacaciones_Becarios.docx
@@ -26,10 +26,9 @@
         <w:tblLook w:val="04A0" w:firstRow="1" w:lastRow="0" w:firstColumn="1" w:lastColumn="0" w:noHBand="0" w:noVBand="1"/>
       </w:tblPr>
       <w:tblGrid>
-        <w:gridCol w:w="1415"/>
-        <w:gridCol w:w="3418"/>
-        <w:gridCol w:w="3243"/>
-        <w:gridCol w:w="1994"/>
+        <w:gridCol w:w="1416"/>
+        <w:gridCol w:w="4326"/>
+        <w:gridCol w:w="4328"/>
       </w:tblGrid>
       <w:tr>
         <w:tc>
@@ -56,7 +55,7 @@
         </w:tc>
         <w:tc>
           <w:tcPr>
-            <w:tcW w:w="1697" w:type="pct"/>
+            <w:tcW w:w="2148" w:type="pct"/>
           </w:tcPr>
           <w:p>
             <w:pPr>
@@ -88,14 +87,7 @@
                 <w:sz w:val="22"/>
                 <w:szCs w:val="20"/>
               </w:rPr>
-              <w:t>d.</w:t>
-            </w:r>
-            <w:r>
-              <w:rPr>
-                <w:sz w:val="22"/>
-                <w:szCs w:val="20"/>
-              </w:rPr>
-              <w:t>Periodo</w:t>
+              <w:t>d.Periodo</w:t>
             </w:r>
             <w:proofErr w:type="gramEnd"/>
             <w:r>
@@ -117,12 +109,12 @@
         </w:tc>
         <w:tc>
           <w:tcPr>
-            <w:tcW w:w="1610" w:type="pct"/>
+            <w:tcW w:w="2148" w:type="pct"/>
           </w:tcPr>
           <w:p>
             <w:pPr>
               <w:spacing w:line="276" w:lineRule="auto"/>
-              <w:jc w:val="left"/>
+              <w:jc w:val="center"/>
               <w:rPr>
                 <w:sz w:val="22"/>
                 <w:szCs w:val="20"/>
@@ -149,14 +141,7 @@
                 <w:sz w:val="22"/>
                 <w:szCs w:val="20"/>
               </w:rPr>
-              <w:t>d.</w:t>
-            </w:r>
-            <w:r>
-              <w:rPr>
-                <w:sz w:val="22"/>
-                <w:szCs w:val="20"/>
-              </w:rPr>
-              <w:t>Periodo</w:t>
+              <w:t>d.Periodo</w:t>
             </w:r>
             <w:proofErr w:type="gramEnd"/>
             <w:r>
@@ -167,60 +152,6 @@
               <w:t>_A</w:t>
             </w:r>
             <w:proofErr w:type="spellEnd"/>
-            <w:r>
-              <w:rPr>
-                <w:sz w:val="22"/>
-                <w:szCs w:val="20"/>
-              </w:rPr>
-              <w:t>}</w:t>
-            </w:r>
-          </w:p>
-        </w:tc>
-        <w:tc>
-          <w:tcPr>
-            <w:tcW w:w="991" w:type="pct"/>
-          </w:tcPr>
-          <w:p>
-            <w:pPr>
-              <w:spacing w:line="276" w:lineRule="auto"/>
-              <w:jc w:val="left"/>
-              <w:rPr>
-                <w:sz w:val="22"/>
-                <w:szCs w:val="20"/>
-              </w:rPr>
-            </w:pPr>
-            <w:r>
-              <w:rPr>
-                <w:sz w:val="22"/>
-                <w:szCs w:val="20"/>
-              </w:rPr>
-              <w:t>AÑO:</w:t>
-            </w:r>
-            <w:r>
-              <w:rPr>
-                <w:sz w:val="22"/>
-                <w:szCs w:val="20"/>
-              </w:rPr>
-              <w:t xml:space="preserve"> {</w:t>
-            </w:r>
-            <w:proofErr w:type="spellStart"/>
-            <w:proofErr w:type="gramStart"/>
-            <w:r>
-              <w:rPr>
-                <w:sz w:val="22"/>
-                <w:szCs w:val="20"/>
-              </w:rPr>
-              <w:t>d.</w:t>
-            </w:r>
-            <w:r>
-              <w:rPr>
-                <w:sz w:val="22"/>
-                <w:szCs w:val="20"/>
-              </w:rPr>
-              <w:t>Anio</w:t>
-            </w:r>
-            <w:proofErr w:type="spellEnd"/>
-            <w:proofErr w:type="gramEnd"/>
             <w:r>
               <w:rPr>
                 <w:sz w:val="22"/>
@@ -235,7 +166,7 @@
         <w:tc>
           <w:tcPr>
             <w:tcW w:w="5000" w:type="pct"/>
-            <w:gridSpan w:val="4"/>
+            <w:gridSpan w:val="3"/>
           </w:tcPr>
           <w:p>
             <w:pPr>
@@ -275,7 +206,7 @@
         <w:tc>
           <w:tcPr>
             <w:tcW w:w="4297" w:type="pct"/>
-            <w:gridSpan w:val="3"/>
+            <w:gridSpan w:val="2"/>
           </w:tcPr>
           <w:p>
             <w:pPr>
@@ -354,7 +285,7 @@
         <w:tc>
           <w:tcPr>
             <w:tcW w:w="4297" w:type="pct"/>
-            <w:gridSpan w:val="3"/>
+            <w:gridSpan w:val="2"/>
           </w:tcPr>
           <w:p>
             <w:pPr>
@@ -426,7 +357,7 @@
         <w:tc>
           <w:tcPr>
             <w:tcW w:w="4297" w:type="pct"/>
-            <w:gridSpan w:val="3"/>
+            <w:gridSpan w:val="2"/>
           </w:tcPr>
           <w:p>
             <w:pPr>
@@ -498,7 +429,7 @@
         <w:tc>
           <w:tcPr>
             <w:tcW w:w="4297" w:type="pct"/>
-            <w:gridSpan w:val="3"/>
+            <w:gridSpan w:val="2"/>
           </w:tcPr>
           <w:p>
             <w:pPr>
@@ -577,7 +508,7 @@
         <w:tc>
           <w:tcPr>
             <w:tcW w:w="4297" w:type="pct"/>
-            <w:gridSpan w:val="3"/>
+            <w:gridSpan w:val="2"/>
           </w:tcPr>
           <w:p>
             <w:pPr>

</xml_diff>

<commit_message>
actualizacion de plantilla vacaciones becarios
</commit_message>
<xml_diff>
--- a/api/src/recursos/plantillas_docx/Formato_Vacaciones_Becarios.docx
+++ b/api/src/recursos/plantillas_docx/Formato_Vacaciones_Becarios.docx
@@ -26,14 +26,16 @@
         <w:tblLook w:val="04A0" w:firstRow="1" w:lastRow="0" w:firstColumn="1" w:lastColumn="0" w:noHBand="0" w:noVBand="1"/>
       </w:tblPr>
       <w:tblGrid>
-        <w:gridCol w:w="1416"/>
-        <w:gridCol w:w="4326"/>
-        <w:gridCol w:w="4328"/>
+        <w:gridCol w:w="1418"/>
+        <w:gridCol w:w="562"/>
+        <w:gridCol w:w="4044"/>
+        <w:gridCol w:w="4046"/>
       </w:tblGrid>
       <w:tr>
         <w:tc>
           <w:tcPr>
-            <w:tcW w:w="703" w:type="pct"/>
+            <w:tcW w:w="983" w:type="pct"/>
+            <w:gridSpan w:val="2"/>
           </w:tcPr>
           <w:p>
             <w:pPr>
@@ -50,12 +52,19 @@
                 <w:szCs w:val="20"/>
               </w:rPr>
               <w:t>PERIODO:</w:t>
+            </w:r>
+            <w:r>
+              <w:rPr>
+                <w:sz w:val="22"/>
+                <w:szCs w:val="20"/>
+              </w:rPr>
+              <w:t xml:space="preserve"> {d.Periodo}</w:t>
             </w:r>
           </w:p>
         </w:tc>
         <w:tc>
           <w:tcPr>
-            <w:tcW w:w="2148" w:type="pct"/>
+            <w:tcW w:w="2008" w:type="pct"/>
           </w:tcPr>
           <w:p>
             <w:pPr>
@@ -78,38 +87,13 @@
                 <w:sz w:val="22"/>
                 <w:szCs w:val="20"/>
               </w:rPr>
-              <w:t xml:space="preserve"> {</w:t>
-            </w:r>
-            <w:proofErr w:type="spellStart"/>
-            <w:proofErr w:type="gramStart"/>
-            <w:r>
-              <w:rPr>
-                <w:sz w:val="22"/>
-                <w:szCs w:val="20"/>
-              </w:rPr>
-              <w:t>d.Periodo</w:t>
-            </w:r>
-            <w:proofErr w:type="gramEnd"/>
-            <w:r>
-              <w:rPr>
-                <w:sz w:val="22"/>
-                <w:szCs w:val="20"/>
-              </w:rPr>
-              <w:t>_De</w:t>
-            </w:r>
-            <w:proofErr w:type="spellEnd"/>
-            <w:r>
-              <w:rPr>
-                <w:sz w:val="22"/>
-                <w:szCs w:val="20"/>
-              </w:rPr>
-              <w:t>}</w:t>
+              <w:t xml:space="preserve"> {d.Periodo_De}</w:t>
             </w:r>
           </w:p>
         </w:tc>
         <w:tc>
           <w:tcPr>
-            <w:tcW w:w="2148" w:type="pct"/>
+            <w:tcW w:w="2008" w:type="pct"/>
           </w:tcPr>
           <w:p>
             <w:pPr>
@@ -132,32 +116,7 @@
                 <w:sz w:val="22"/>
                 <w:szCs w:val="20"/>
               </w:rPr>
-              <w:t xml:space="preserve"> {</w:t>
-            </w:r>
-            <w:proofErr w:type="spellStart"/>
-            <w:proofErr w:type="gramStart"/>
-            <w:r>
-              <w:rPr>
-                <w:sz w:val="22"/>
-                <w:szCs w:val="20"/>
-              </w:rPr>
-              <w:t>d.Periodo</w:t>
-            </w:r>
-            <w:proofErr w:type="gramEnd"/>
-            <w:r>
-              <w:rPr>
-                <w:sz w:val="22"/>
-                <w:szCs w:val="20"/>
-              </w:rPr>
-              <w:t>_A</w:t>
-            </w:r>
-            <w:proofErr w:type="spellEnd"/>
-            <w:r>
-              <w:rPr>
-                <w:sz w:val="22"/>
-                <w:szCs w:val="20"/>
-              </w:rPr>
-              <w:t>}</w:t>
+              <w:t xml:space="preserve"> {d.Periodo_A}</w:t>
             </w:r>
           </w:p>
         </w:tc>
@@ -166,7 +125,7 @@
         <w:tc>
           <w:tcPr>
             <w:tcW w:w="5000" w:type="pct"/>
-            <w:gridSpan w:val="3"/>
+            <w:gridSpan w:val="4"/>
           </w:tcPr>
           <w:p>
             <w:pPr>
@@ -177,13 +136,34 @@
                 <w:szCs w:val="20"/>
               </w:rPr>
             </w:pPr>
+            <w:r>
+              <w:rPr>
+                <w:sz w:val="22"/>
+                <w:szCs w:val="20"/>
+              </w:rPr>
+              <w:t>REANUDANDO EN: {</w:t>
+            </w:r>
+            <w:r>
+              <w:rPr>
+                <w:sz w:val="22"/>
+                <w:szCs w:val="20"/>
+              </w:rPr>
+              <w:t>d.</w:t>
+            </w:r>
+            <w:r>
+              <w:rPr>
+                <w:sz w:val="22"/>
+                <w:szCs w:val="20"/>
+              </w:rPr>
+              <w:t>Fecha_Regreso}</w:t>
+            </w:r>
           </w:p>
         </w:tc>
       </w:tr>
       <w:tr>
         <w:tc>
           <w:tcPr>
-            <w:tcW w:w="703" w:type="pct"/>
+            <w:tcW w:w="704" w:type="pct"/>
           </w:tcPr>
           <w:p>
             <w:pPr>
@@ -205,8 +185,8 @@
         </w:tc>
         <w:tc>
           <w:tcPr>
-            <w:tcW w:w="4297" w:type="pct"/>
-            <w:gridSpan w:val="2"/>
+            <w:tcW w:w="4296" w:type="pct"/>
+            <w:gridSpan w:val="3"/>
           </w:tcPr>
           <w:p>
             <w:pPr>
@@ -224,8 +204,6 @@
               </w:rPr>
               <w:t>{</w:t>
             </w:r>
-            <w:proofErr w:type="spellStart"/>
-            <w:proofErr w:type="gramStart"/>
             <w:r>
               <w:rPr>
                 <w:sz w:val="22"/>
@@ -240,7 +218,6 @@
               </w:rPr>
               <w:t>Nombre</w:t>
             </w:r>
-            <w:proofErr w:type="gramEnd"/>
             <w:r>
               <w:rPr>
                 <w:sz w:val="22"/>
@@ -248,7 +225,6 @@
               </w:rPr>
               <w:t>_Becario</w:t>
             </w:r>
-            <w:proofErr w:type="spellEnd"/>
             <w:r>
               <w:rPr>
                 <w:sz w:val="22"/>
@@ -262,7 +238,7 @@
       <w:tr>
         <w:tc>
           <w:tcPr>
-            <w:tcW w:w="703" w:type="pct"/>
+            <w:tcW w:w="704" w:type="pct"/>
           </w:tcPr>
           <w:p>
             <w:pPr>
@@ -284,8 +260,8 @@
         </w:tc>
         <w:tc>
           <w:tcPr>
-            <w:tcW w:w="4297" w:type="pct"/>
-            <w:gridSpan w:val="2"/>
+            <w:tcW w:w="4296" w:type="pct"/>
+            <w:gridSpan w:val="3"/>
           </w:tcPr>
           <w:p>
             <w:pPr>
@@ -303,8 +279,6 @@
               </w:rPr>
               <w:t>{</w:t>
             </w:r>
-            <w:proofErr w:type="spellStart"/>
-            <w:proofErr w:type="gramStart"/>
             <w:r>
               <w:rPr>
                 <w:sz w:val="22"/>
@@ -317,16 +291,7 @@
                 <w:sz w:val="22"/>
                 <w:szCs w:val="20"/>
               </w:rPr>
-              <w:t>Carrera</w:t>
-            </w:r>
-            <w:proofErr w:type="spellEnd"/>
-            <w:proofErr w:type="gramEnd"/>
-            <w:r>
-              <w:rPr>
-                <w:sz w:val="22"/>
-                <w:szCs w:val="20"/>
-              </w:rPr>
-              <w:t>}</w:t>
+              <w:t>Carrera}</w:t>
             </w:r>
           </w:p>
         </w:tc>
@@ -334,7 +299,7 @@
       <w:tr>
         <w:tc>
           <w:tcPr>
-            <w:tcW w:w="703" w:type="pct"/>
+            <w:tcW w:w="704" w:type="pct"/>
           </w:tcPr>
           <w:p>
             <w:pPr>
@@ -356,8 +321,8 @@
         </w:tc>
         <w:tc>
           <w:tcPr>
-            <w:tcW w:w="4297" w:type="pct"/>
-            <w:gridSpan w:val="2"/>
+            <w:tcW w:w="4296" w:type="pct"/>
+            <w:gridSpan w:val="3"/>
           </w:tcPr>
           <w:p>
             <w:pPr>
@@ -375,8 +340,6 @@
               </w:rPr>
               <w:t>{</w:t>
             </w:r>
-            <w:proofErr w:type="spellStart"/>
-            <w:proofErr w:type="gramStart"/>
             <w:r>
               <w:rPr>
                 <w:sz w:val="22"/>
@@ -389,16 +352,7 @@
                 <w:sz w:val="22"/>
                 <w:szCs w:val="20"/>
               </w:rPr>
-              <w:t>Promocion</w:t>
-            </w:r>
-            <w:proofErr w:type="spellEnd"/>
-            <w:proofErr w:type="gramEnd"/>
-            <w:r>
-              <w:rPr>
-                <w:sz w:val="22"/>
-                <w:szCs w:val="20"/>
-              </w:rPr>
-              <w:t>}</w:t>
+              <w:t>Promocion}</w:t>
             </w:r>
           </w:p>
         </w:tc>
@@ -406,7 +360,7 @@
       <w:tr>
         <w:tc>
           <w:tcPr>
-            <w:tcW w:w="703" w:type="pct"/>
+            <w:tcW w:w="704" w:type="pct"/>
           </w:tcPr>
           <w:p>
             <w:pPr>
@@ -428,8 +382,8 @@
         </w:tc>
         <w:tc>
           <w:tcPr>
-            <w:tcW w:w="4297" w:type="pct"/>
-            <w:gridSpan w:val="2"/>
+            <w:tcW w:w="4296" w:type="pct"/>
+            <w:gridSpan w:val="3"/>
           </w:tcPr>
           <w:p>
             <w:pPr>
@@ -447,8 +401,6 @@
               </w:rPr>
               <w:t>{</w:t>
             </w:r>
-            <w:proofErr w:type="spellStart"/>
-            <w:proofErr w:type="gramStart"/>
             <w:r>
               <w:rPr>
                 <w:sz w:val="22"/>
@@ -461,23 +413,7 @@
                 <w:sz w:val="22"/>
                 <w:szCs w:val="20"/>
               </w:rPr>
-              <w:t>Adscripcion</w:t>
-            </w:r>
-            <w:proofErr w:type="gramEnd"/>
-            <w:r>
-              <w:rPr>
-                <w:sz w:val="22"/>
-                <w:szCs w:val="20"/>
-              </w:rPr>
-              <w:t>_SEDE</w:t>
-            </w:r>
-            <w:proofErr w:type="spellEnd"/>
-            <w:r>
-              <w:rPr>
-                <w:sz w:val="22"/>
-                <w:szCs w:val="20"/>
-              </w:rPr>
-              <w:t>}</w:t>
+              <w:t>Adscripcion_SEDE}</w:t>
             </w:r>
           </w:p>
         </w:tc>
@@ -485,7 +421,7 @@
       <w:tr>
         <w:tc>
           <w:tcPr>
-            <w:tcW w:w="703" w:type="pct"/>
+            <w:tcW w:w="704" w:type="pct"/>
           </w:tcPr>
           <w:p>
             <w:pPr>
@@ -507,8 +443,8 @@
         </w:tc>
         <w:tc>
           <w:tcPr>
-            <w:tcW w:w="4297" w:type="pct"/>
-            <w:gridSpan w:val="2"/>
+            <w:tcW w:w="4296" w:type="pct"/>
+            <w:gridSpan w:val="3"/>
           </w:tcPr>
           <w:p>
             <w:pPr>
@@ -526,8 +462,6 @@
               </w:rPr>
               <w:t>{</w:t>
             </w:r>
-            <w:proofErr w:type="spellStart"/>
-            <w:proofErr w:type="gramStart"/>
             <w:r>
               <w:rPr>
                 <w:sz w:val="22"/>
@@ -540,16 +474,7 @@
                 <w:sz w:val="22"/>
                 <w:szCs w:val="20"/>
               </w:rPr>
-              <w:t>Jornada</w:t>
-            </w:r>
-            <w:proofErr w:type="spellEnd"/>
-            <w:proofErr w:type="gramEnd"/>
-            <w:r>
-              <w:rPr>
-                <w:sz w:val="22"/>
-                <w:szCs w:val="20"/>
-              </w:rPr>
-              <w:t>}</w:t>
+              <w:t>Jornada}</w:t>
             </w:r>
           </w:p>
         </w:tc>

</xml_diff>